<commit_message>
Improve wind presentation with power curve, location map, and revised notes
</commit_message>
<xml_diff>
--- a/presentation/Wind_Power_Plant_Speaking_Script_CN_EN.docx
+++ b/presentation/Wind_Power_Plant_Speaking_Script_CN_EN.docx
@@ -40,7 +40,7 @@
     </w:p>
     <w:p>
       <w:r>
-        <w:t>英文正文约2205词（A约1094词，B约1111词）。20分钟包含指图、解释公式、换页和停顿；时长是排练目标，并非仅靠字数保证。建议按下表计时，每人讲完后留出数秒交接。</w:t>
+        <w:t>英文正文约2173词（A约1088词，B约1085词）。20分钟包含指图、解释公式、换页和停顿；时长是排练目标，并非仅靠字数保证。建议按下表计时，每人讲完后留出数秒交接。</w:t>
       </w:r>
     </w:p>
     <w:p>
@@ -50,7 +50,7 @@
     </w:p>
     <w:p>
       <w:r>
-        <w:t>来源核验限制：上传的要求和课件已逐页读取；外部官方网页被当前环境网络策略阻断，公开链接未能在线逐条核验。因此未使用逐字引语，也不声称这些网页已访问验证。提交前请打开文末链接，核对项目/报告信息。课件引用使用PDF页码。</w:t>
+        <w:t>来源核验状态：上传的要求和课件已逐页读取；Natural Earth的1:50m地理数据已成功下载并核验，位置图为原创绘制。风场标记只表示约克郡海岸以东的大致海上位置，并非经核验的项目边界。能源类官方网页仍被网络策略阻断，R1–R7未能在线逐条核验，因此未使用逐字引语，也不声称已完成其在线验证。课件引用使用PDF页码，报告数字保留统计年份。</w:t>
       </w:r>
     </w:p>
     <w:p>
@@ -320,7 +320,7 @@
           </w:tcPr>
           <w:p>
             <w:r>
-              <w:t>Control protects the machine and improves capture</w:t>
+              <w:t>From wind speed to electrical output</w:t>
             </w:r>
           </w:p>
         </w:tc>
@@ -1109,7 +1109,7 @@
         <w:pStyle w:val="Heading2"/>
       </w:pPr>
       <w:r>
-        <w:t>Slide 5 · Control protects the machine and improves capture</w:t>
+        <w:t>Slide 5 · From wind speed to electrical output</w:t>
       </w:r>
     </w:p>
     <w:p>
@@ -1130,7 +1130,7 @@
         <w:pStyle w:val="ListBullet"/>
       </w:pPr>
       <w:r>
-        <w:t>Yaw: align the rotor with the wind direction</w:t>
+        <w:t>Cut-in: below the operating threshold, output is zero</w:t>
       </w:r>
     </w:p>
     <w:p>
@@ -1138,7 +1138,7 @@
         <w:pStyle w:val="ListBullet"/>
       </w:pPr>
       <w:r>
-        <w:t>Pitch: regulate aerodynamic power and structural loading</w:t>
+        <w:t>Below rated: torque / speed control helps capture energy</w:t>
       </w:r>
     </w:p>
     <w:p>
@@ -1146,7 +1146,7 @@
         <w:pStyle w:val="ListBullet"/>
       </w:pPr>
       <w:r>
-        <w:t>Torque / speed control: optimize below-rated operation</w:t>
+        <w:t>At rated: pitch control limits power; high winds may trigger shutdown</w:t>
       </w:r>
     </w:p>
     <w:p>
@@ -1154,7 +1154,7 @@
         <w:pStyle w:val="ListBullet"/>
       </w:pPr>
       <w:r>
-        <w:t>Protection: curtail or stop when operating limits are exceeded</w:t>
+        <w:t>Teaching thresholds: 3 / 12 / 25 m/s; actual turbine designs vary</w:t>
       </w:r>
     </w:p>
     <w:p>
@@ -1167,7 +1167,7 @@
     </w:p>
     <w:p>
       <w:r>
-        <w:t>Three control functions are particularly important. Yaw control turns the nacelle so that the rotor faces the wind direction. Pitch control changes the angle of the blades, affecting aerodynamic forces and the amount of power extracted. Generator torque and speed control help maintain efficient operation below rated power. As wind speed increases toward and beyond the rated operating point, pitch control limits aerodynamic power and helps manage structural loads. At very high winds, the turbine may shut down for safety. Exact operating thresholds depend on the turbine model; there is no single universal cut-out speed for every machine. The plant controller adds another layer. It can coordinate active-power limits, reactive-power commands, and turbine operation across the farm. These controls therefore serve two purposes: capture useful energy when conditions allow, and protect the equipment when conditions become demanding. The same hardware also helps explain why wind turbines can contribute to grid support, which my partner will discuss later.</w:t>
+        <w:t>This curve shows why turbine output does not keep increasing as wind speed cubed. It is a teaching example, with cut-in at three metres per second, rated operation at twelve, and shutdown at twenty-five. Actual thresholds and storm controls vary by turbine. Below cut-in, the machine does not generate. Between cut-in and the rated point, output increases, and torque or speed control helps capture energy efficiently. Above the rated point, blade-pitch control limits power and structural loading, so the curve levels off. At the high-wind limit shown here, protection stops generation. Yaw control has a different role: it aligns the rotor with the wind direction. Follow the rising section, the plateau, and the shutdown step on the graph. The important message is that aerodynamics, rated capacity, and control limits determine actual output together.</w:t>
       </w:r>
     </w:p>
     <w:p>
@@ -1180,7 +1180,7 @@
     </w:p>
     <w:p>
       <w:r>
-        <w:t>三个控制不要混淆：偏航对准方向、变桨调节叶片角、转矩/转速优化捕获。超过工作限制会限功率或停机；具体阈值取决于型号。</w:t>
+        <w:t>沿曲线从左向右讲：启动前不发电，额定点以下输出增加，额定点后变桨限制功率，超过安全工作范围则停机。3、12、25 m/s均是教学示例，不是Hornsea 2或某型号的官方功率曲线。偏航让转子对准风向。</w:t>
       </w:r>
     </w:p>
     <w:p>
@@ -1327,6 +1327,14 @@
     </w:p>
     <w:p>
       <w:pPr>
+        <w:pStyle w:val="ListBullet"/>
+      </w:pPr>
+      <w:r>
+        <w:t>35% capacity factor does not imply 65% of wind energy is wasted</w:t>
+      </w:r>
+    </w:p>
+    <w:p>
+      <w:pPr>
         <w:pStyle w:val="Heading3"/>
       </w:pPr>
       <w:r>
@@ -1335,7 +1343,7 @@
     </w:p>
     <w:p>
       <w:r>
-        <w:t>There are three performance concepts that we should keep separate. First, the power coefficient describes aerodynamic capture at a particular operating condition. Second, downstream efficiency describes mechanical and electrical conversion losses. Third, capacity factor describes energy production over time. Capacity factor is actual energy divided by rated power multiplied by the period length. It is not the fraction of wind energy converted into electricity. For example, assume a three-megawatt turbine has an annual capacity factor of thirty-five percent. Over a non-leap year, three megawatts multiplied by eight thousand seven hundred and sixty hours and zero point three five gives about nine point two gigawatt-hours. The thirty-five percent value is an assumption, not a universal industry average. Actual annual output depends on the wind distribution, turbine design, wake effects, availability, electrical losses, and curtailment. This is why two turbines with the same rating may generate different amounts of energy. We have now covered the conversion process and equipment. I will hand over to my partner to explain what happens when the wind farm becomes part of the grid.</w:t>
+        <w:t>There are three performance concepts that we should keep separate. First, the power coefficient describes aerodynamic capture at a particular operating condition. Second, downstream efficiency describes mechanical and electrical conversion losses. Third, capacity factor describes energy production over time. Capacity factor is actual energy divided by rated power multiplied by the period length. It is not the fraction of wind energy converted into electricity. A thirty-five percent capacity factor does not mean that sixty-five percent of the available wind energy was wasted. For example, assume a three-megawatt turbine has an annual capacity factor of thirty-five percent. Over a non-leap year, three megawatts multiplied by eight thousand seven hundred and sixty hours and zero point three five gives about nine point two gigawatt-hours. The thirty-five percent value is an assumption, not a universal industry average. Actual annual output depends on the wind distribution, turbine design, wake effects, availability, electrical losses, and curtailment. This is why two turbines with the same rating may generate different amounts of energy. We have now covered the conversion process and equipment. I will hand over to my partner to explain what happens when the wind farm becomes part of the grid.</w:t>
       </w:r>
     </w:p>
     <w:p>
@@ -1348,7 +1356,7 @@
     </w:p>
     <w:p>
       <w:r>
-        <w:t>风机效率不等于容量因子。示例3MW和35%均是假设，8760小时为非闰年。提到尾流、可利用率、限电、电损都会影响年发电量。此页结束交接。</w:t>
+        <w:t>风机效率不等于容量因子。示例3MW和35%均是假设，8760小时为非闰年。提到尾流、可利用率、限电、电损都会影响年发电量。此页结束交接。 特别强调：35%的容量因子不代表浪费了65%的风能，而是年发电量相当于全年持续额定输出的35%。</w:t>
       </w:r>
     </w:p>
     <w:p>
@@ -1702,7 +1710,7 @@
     </w:p>
     <w:p>
       <w:r>
-        <w:t>讲者 B | 16:20–18:10 | 110秒 | 来源：R6, R3</w:t>
+        <w:t>讲者 B | 16:20–18:10 | 110秒 | 来源：R6, R3, R8</w:t>
       </w:r>
     </w:p>
     <w:p>
@@ -1718,6 +1726,14 @@
         <w:pStyle w:val="ListBullet"/>
       </w:pPr>
       <w:r>
+        <w:t>Offshore in the North Sea, off the Yorkshire coast of Great Britain</w:t>
+      </w:r>
+    </w:p>
+    <w:p>
+      <w:pPr>
+        <w:pStyle w:val="ListBullet"/>
+      </w:pPr>
+      <w:r>
         <w:t>Fully operational in 2022</w:t>
       </w:r>
     </w:p>
@@ -1726,7 +1742,7 @@
         <w:pStyle w:val="ListBullet"/>
       </w:pPr>
       <w:r>
-        <w:t>165 offshore turbines × 8 MW = 1,320 MW ≈ 1.3 GW</w:t>
+        <w:t>165 turbines × 8 MW = 1,320 MW ≈ 1.3 GW</w:t>
       </w:r>
     </w:p>
     <w:p>
@@ -1734,7 +1750,59 @@
         <w:pStyle w:val="ListBullet"/>
       </w:pPr>
       <w:r>
-        <w:t>A collection network and offshore / onshore infrastructure export power</w:t>
+        <w:t>Turbines → collection network / substations → onshore grid</w:t>
+      </w:r>
+    </w:p>
+    <w:p>
+      <w:pPr>
+        <w:pStyle w:val="Heading3"/>
+      </w:pPr>
+      <w:r>
+        <w:t>English speaking script</w:t>
+      </w:r>
+    </w:p>
+    <w:p>
+      <w:r>
+        <w:t>Hornsea Two is a real offshore wind power plant in the United Kingdom. On the map, locate Great Britain and the Yorkshire coast, then follow the arrow toward the offshore project area in the North Sea. The coastline is based on Natural Earth geographic data; the project marker is approximate, rather than an exact site boundary. The developer reports that Hornsea Two became fully operational in twenty-twenty-two. It has one hundred and sixty-five turbines rated at eight megawatts each. Together, that is one thousand three hundred and twenty megawatts, or approximately one point three gigawatts of rated capacity. Turbines feed a collection network and substations, and export cables carry electricity toward the onshore grid. The offshore setting offers an opportunity to use a strong wind resource and large turbines, but it also requires marine foundations, reliable subsea cables, and maintenance access in difficult weather. This example connects our earlier topics: energy conversion happens at each turbine, while electrical coordination happens across the wind farm. The one point three gigawatts is a rating, not continuous production or an annual energy figure.</w:t>
+      </w:r>
+    </w:p>
+    <w:p>
+      <w:pPr>
+        <w:pStyle w:val="Heading3"/>
+      </w:pPr>
+      <w:r>
+        <w:t>中文理解 / 演示提示</w:t>
+      </w:r>
+    </w:p>
+    <w:p>
+      <w:r>
+        <w:t>先指位置图：英国约克郡海岸以东的北海海上风场。底图来自Natural Earth公开地理数据；风场标记仅代表大致位置，不是经核验的准确项目边界。再讲2022全面投运、165台×8MW≈1.3GW，以及海底电缆、变电站和维护难点。额定容量不等于持续输出或年发电量。</w:t>
+      </w:r>
+    </w:p>
+    <w:p>
+      <w:r>
+        <w:t>本页出处：R6 Ørsted. Hornsea 2: project information.；R3 Burton, T., Jenkins, N., Sharpe, D., &amp; Bossanyi, E. (2011). Wind Energy Handbook (2nd ed.). Wiley.；R8 Natural Earth. Admin 0 – Countries, 1:50m (public-domain geographic data).</w:t>
+      </w:r>
+    </w:p>
+    <w:p>
+      <w:pPr>
+        <w:pStyle w:val="Heading2"/>
+      </w:pPr>
+      <w:r>
+        <w:t>Slide 13 · How wind compares with other power plants</w:t>
+      </w:r>
+    </w:p>
+    <w:p>
+      <w:r>
+        <w:t>讲者 B | 18:10–19:20 | 70秒 | 来源：R1, R3, R5</w:t>
+      </w:r>
+    </w:p>
+    <w:p>
+      <w:pPr>
+        <w:pStyle w:val="Heading3"/>
+      </w:pPr>
+      <w:r>
+        <w:t>PPT英文要点</w:t>
       </w:r>
     </w:p>
     <w:p>
@@ -1742,7 +1810,31 @@
         <w:pStyle w:val="ListBullet"/>
       </w:pPr>
       <w:r>
-        <w:t>Rated capacity is not continuous output or annual energy</w:t>
+        <w:t>Wind: low life-cycle emissions and no fuel purchase; variable supply</w:t>
+      </w:r>
+    </w:p>
+    <w:p>
+      <w:pPr>
+        <w:pStyle w:val="ListBullet"/>
+      </w:pPr>
+      <w:r>
+        <w:t>Gas: controllable output within operating limits; fuel cost and emissions</w:t>
+      </w:r>
+    </w:p>
+    <w:p>
+      <w:pPr>
+        <w:pStyle w:val="ListBullet"/>
+      </w:pPr>
+      <w:r>
+        <w:t>Solar PV: modular and low-carbon; daylight and weather constraints</w:t>
+      </w:r>
+    </w:p>
+    <w:p>
+      <w:pPr>
+        <w:pStyle w:val="ListBullet"/>
+      </w:pPr>
+      <w:r>
+        <w:t>Reservoir hydro: flexible where water is available; geographical and ecological limits</w:t>
       </w:r>
     </w:p>
     <w:p>
@@ -1755,7 +1847,7 @@
     </w:p>
     <w:p>
       <w:r>
-        <w:t>Hornsea Two is a useful real-world example of an offshore wind power plant in the United Kingdom. The developer reports that the project became fully operational in twenty-twenty-two. It uses one hundred and sixty-five turbines rated at eight megawatts each. Multiplying those numbers gives one thousand three hundred and twenty megawatts, commonly described as approximately one point three gigawatts. That is the rated capacity of the turbines, not a guarantee of continuous output. The simplified diagram shows the functional arrangement rather than the actual engineering design. Turbines feed a collection network. Offshore electrical infrastructure combines their output, and export cables carry electricity toward the onshore grid connection. This arrangement demonstrates why offshore wind is a complete plant-design problem. Engineers need reliable marine foundations, cable systems, protection, communication, and maintenance access. Strong wind resources and large turbines create an opportunity for substantial energy production, but the project also faces weather constraints, demanding installation conditions, and expensive repairs. The case links our earlier topics together: aerodynamic conversion takes place at each turbine, while electrical coordination and grid integration take place across the whole wind farm. We do not estimate Hornsea Two’s annual generation here because that would require a project-specific production figure or an explicitly justified capacity factor.</w:t>
+        <w:t>The strongest comparison asks what service each technology provides and what constraints it faces. Wind offers low life-cycle emissions and no fuel purchase during generation, but its output follows a variable resource. Gas plants can adjust output within operating limits, but they require fuel and produce emissions. Solar photovoltaics are modular and low-carbon, but their resource depends on daylight and weather. Reservoir hydropower can be flexible where water is available, yet suitable sites are limited and projects can have major ecological impacts. These technologies are not identical substitutes in every hour. We must consider energy, dependable capacity, flexibility, environmental effects, and grid services together. Wind is therefore valuable as part of a well-designed generation portfolio, rather than because it wins every comparison by itself.</w:t>
       </w:r>
     </w:p>
     <w:p>
@@ -1768,12 +1860,12 @@
     </w:p>
     <w:p>
       <w:r>
-        <w:t>英国Hornsea 2案例：2022全面投运、165台×8MW=1320MW。图为原创简化示意，不是官方地理或工程接线图。不把额定容量当全年输出，不标“全球最大”以免过时。</w:t>
-      </w:r>
-    </w:p>
-    <w:p>
-      <w:r>
-        <w:t>本页出处：R6 Ørsted. Hornsea 2: project information.；R3 Burton, T., Jenkins, N., Sharpe, D., &amp; Bossanyi, E. (2011). Wind Energy Handbook (2nd ed.). Wiley.</w:t>
+        <w:t>比较有利与限制，不说风电全面替代其他机组。水电特指水库式，不能把所有径流式水电都说成可灵活调度。不要给未经核实的LCOE成本排名。</w:t>
+      </w:r>
+    </w:p>
+    <w:p>
+      <w:r>
+        <w:t>本页出处：R1 U.S. Department of Energy. How Do Wind Turbines Work?；R3 Burton, T., Jenkins, N., Sharpe, D., &amp; Bossanyi, E. (2011). Wind Energy Handbook (2nd ed.). Wiley.；R5 IPCC. (2014). Climate Change 2014: Mitigation of Climate Change. Annex III, Table A.III.2.</w:t>
       </w:r>
     </w:p>
     <w:p>
@@ -1781,12 +1873,12 @@
         <w:pStyle w:val="Heading2"/>
       </w:pPr>
       <w:r>
-        <w:t>Slide 13 · How wind compares with other power plants</w:t>
-      </w:r>
-    </w:p>
-    <w:p>
-      <w:r>
-        <w:t>讲者 B | 18:10–19:20 | 70秒 | 来源：R1, R3, R5</w:t>
+        <w:t>Slide 14 · Three conclusions</w:t>
+      </w:r>
+    </w:p>
+    <w:p>
+      <w:r>
+        <w:t>讲者 B | 19:20–20:00 | 40秒 | 来源：R3, C2, C3</w:t>
       </w:r>
     </w:p>
     <w:p>
@@ -1802,7 +1894,7 @@
         <w:pStyle w:val="ListBullet"/>
       </w:pPr>
       <w:r>
-        <w:t>Wind: low life-cycle emissions and no fuel purchase; variable supply</w:t>
+        <w:t>Aerodynamics and equipment convert a variable resource into electricity</w:t>
       </w:r>
     </w:p>
     <w:p>
@@ -1810,7 +1902,7 @@
         <w:pStyle w:val="ListBullet"/>
       </w:pPr>
       <w:r>
-        <w:t>Gas: controllable output within operating limits; fuel cost and emissions</w:t>
+        <w:t>Performance needs both conversion metrics and annual-energy metrics</w:t>
       </w:r>
     </w:p>
     <w:p>
@@ -1818,7 +1910,7 @@
         <w:pStyle w:val="ListBullet"/>
       </w:pPr>
       <w:r>
-        <w:t>Solar PV: modular and low-carbon; daylight and weather constraints</w:t>
+        <w:t>Low-carbon value depends on sound siting and effective grid integration</w:t>
       </w:r>
     </w:p>
     <w:p>
@@ -1826,7 +1918,7 @@
         <w:pStyle w:val="ListBullet"/>
       </w:pPr>
       <w:r>
-        <w:t>Reservoir hydro: flexible where water is available; geographical and ecological limits</w:t>
+        <w:t>Thank you — questions?</w:t>
       </w:r>
     </w:p>
     <w:p>
@@ -1839,7 +1931,7 @@
     </w:p>
     <w:p>
       <w:r>
-        <w:t>The strongest comparison asks what service each technology provides and what constraints it faces. Wind offers low life-cycle emissions and no fuel purchase during generation, but its output follows a variable resource. Gas plants can adjust output within operating limits, but they require fuel and produce emissions. Solar photovoltaics are modular and low-carbon, but their resource depends on daylight and weather. Reservoir hydropower can be flexible where water is available, yet suitable sites are limited and projects can have major ecological impacts. These technologies are not identical substitutes in every hour. We must consider energy, dependable capacity, flexibility, environmental effects, and grid services together. Wind is therefore valuable as part of a well-designed generation portfolio, rather than because it wins every comparison by itself.</w:t>
+        <w:t>To conclude, wind power combines a renewable resource with controlled energy-conversion equipment. Its performance must be assessed using both conversion metrics and energy production over time; capacity factor is not efficiency. Finally, wind’s low-carbon benefit is strongest when projects are responsibly sited and properly integrated into the power system. The key question is not only whether a turbine can generate electricity, but how the whole plant delivers useful electricity safely and reliably. Thank you for listening. We are happy to take your questions.</w:t>
       </w:r>
     </w:p>
     <w:p>
@@ -1852,12 +1944,43 @@
     </w:p>
     <w:p>
       <w:r>
-        <w:t>比较有利与限制，不说风电全面替代其他机组。水电特指水库式，不能把所有径流式水电都说成可灵活调度。不要给未经核实的LCOE成本排名。</w:t>
-      </w:r>
-    </w:p>
-    <w:p>
-      <w:r>
-        <w:t>本页出处：R1 U.S. Department of Energy. How Do Wind Turbines Work?；R3 Burton, T., Jenkins, N., Sharpe, D., &amp; Bossanyi, E. (2011). Wind Energy Handbook (2nd ed.). Wiley.；R5 IPCC. (2014). Climate Change 2014: Mitigation of Climate Change. Annex III, Table A.III.2.</w:t>
+        <w:t>三句收束：原理、性能指标、电网和环境。邀请提问后进入单独10分钟问答；参考文献与备份页不计入20分钟。</w:t>
+      </w:r>
+    </w:p>
+    <w:p>
+      <w:r>
+        <w:t>本页出处：R3 Burton, T., Jenkins, N., Sharpe, D., &amp; Bossanyi, E. (2011). Wind Energy Handbook (2nd ed.). Wiley.；C2 Mehrjerdi, H. Course slides: 2–Voltage Control.pdf, PDF pp. 17–21 and 33.；C3 Mehrjerdi, H. Course slides: 3–Frequency Control.pdf, PDF pp. 12–13 and 24–29.</w:t>
+      </w:r>
+    </w:p>
+    <w:p>
+      <w:pPr>
+        <w:pStyle w:val="Heading1"/>
+      </w:pPr>
+      <w:r>
+        <w:t>交接句</w:t>
+      </w:r>
+    </w:p>
+    <w:p>
+      <w:r>
+        <w:t>A（第7页结尾）：We have now covered the conversion process and equipment. I will hand over to my partner to explain what happens when the wind farm becomes part of the grid.</w:t>
+      </w:r>
+    </w:p>
+    <w:p>
+      <w:r>
+        <w:t>B（第8页开头）：Thank you. Our course explains that frequency is closely linked to the balance between generation and demand, including losses.</w:t>
+      </w:r>
+    </w:p>
+    <w:p>
+      <w:pPr>
+        <w:pStyle w:val="Heading1"/>
+      </w:pPr>
+      <w:r>
+        <w:t>10分钟问答准备</w:t>
+      </w:r>
+    </w:p>
+    <w:p>
+      <w:r>
+        <w:t>A优先回答叶片原理、Betz上限、设备、公式和容量因子问题；B优先回答电网控制、环境、应用案例与比较。未被问到时无需展示全部备份页。</w:t>
       </w:r>
     </w:p>
     <w:p>
@@ -1865,83 +1988,252 @@
         <w:pStyle w:val="Heading2"/>
       </w:pPr>
       <w:r>
-        <w:t>Slide 14 · Three conclusions</w:t>
-      </w:r>
-    </w:p>
-    <w:p>
-      <w:r>
-        <w:t>讲者 B | 19:20–20:00 | 40秒 | 来源：R3, C2, C3</w:t>
-      </w:r>
-    </w:p>
-    <w:p>
-      <w:pPr>
-        <w:pStyle w:val="Heading3"/>
-      </w:pPr>
-      <w:r>
-        <w:t>PPT英文要点</w:t>
-      </w:r>
-    </w:p>
-    <w:p>
-      <w:pPr>
-        <w:pStyle w:val="ListBullet"/>
-      </w:pPr>
-      <w:r>
-        <w:t>Aerodynamics and equipment convert a variable resource into electricity</w:t>
-      </w:r>
-    </w:p>
-    <w:p>
-      <w:pPr>
-        <w:pStyle w:val="ListBullet"/>
-      </w:pPr>
-      <w:r>
-        <w:t>Performance needs both conversion metrics and annual-energy metrics</w:t>
-      </w:r>
-    </w:p>
-    <w:p>
-      <w:pPr>
-        <w:pStyle w:val="ListBullet"/>
-      </w:pPr>
-      <w:r>
-        <w:t>Low-carbon value depends on sound siting and effective grid integration</w:t>
-      </w:r>
-    </w:p>
-    <w:p>
-      <w:pPr>
-        <w:pStyle w:val="ListBullet"/>
-      </w:pPr>
-      <w:r>
-        <w:t>Thank you — questions?</w:t>
-      </w:r>
-    </w:p>
-    <w:p>
-      <w:pPr>
-        <w:pStyle w:val="Heading3"/>
-      </w:pPr>
-      <w:r>
-        <w:t>English speaking script</w:t>
-      </w:r>
-    </w:p>
-    <w:p>
-      <w:r>
-        <w:t>To conclude, wind power combines a renewable resource with controlled energy-conversion equipment. Its performance must be assessed using both conversion metrics and energy production over time; capacity factor is not efficiency. Finally, wind’s low-carbon benefit is strongest when projects are responsibly sited and properly integrated into the power system. The key question is not only whether a turbine can generate electricity, but how the whole plant delivers useful electricity safely and reliably. Thank you for listening. We are happy to take your questions.</w:t>
-      </w:r>
-    </w:p>
-    <w:p>
-      <w:pPr>
-        <w:pStyle w:val="Heading3"/>
-      </w:pPr>
-      <w:r>
-        <w:t>中文理解 / 演示提示</w:t>
-      </w:r>
-    </w:p>
-    <w:p>
-      <w:r>
-        <w:t>三句收束：原理、性能指标、电网和环境。邀请提问后进入单独10分钟问答；参考文献与备份页不计入20分钟。</w:t>
-      </w:r>
-    </w:p>
-    <w:p>
-      <w:r>
-        <w:t>本页出处：R3 Burton, T., Jenkins, N., Sharpe, D., &amp; Bossanyi, E. (2011). Wind Energy Handbook (2nd ed.). Wiley.；C2 Mehrjerdi, H. Course slides: 2–Voltage Control.pdf, PDF pp. 17–21 and 33.；C3 Mehrjerdi, H. Course slides: 3–Frequency Control.pdf, PDF pp. 12–13 and 24–29.</w:t>
+        <w:t>Q1. Are 3, 12 and 25 m/s universal turbine thresholds?</w:t>
+      </w:r>
+    </w:p>
+    <w:p>
+      <w:r>
+        <w:t>建议回答：讲者A | 来源：R2, R3</w:t>
+      </w:r>
+    </w:p>
+    <w:p>
+      <w:r>
+        <w:t>No. They are assumed values for our illustrative curve, not measured Hornsea 2 operating thresholds. Real turbines have model-specific power curves, operating limits and storm-control strategies.</w:t>
+      </w:r>
+    </w:p>
+    <w:p>
+      <w:r>
+        <w:t>中文：不是。这三个数字是教学假设，不是Hornsea 2机组的实测或官方阈值。</w:t>
+      </w:r>
+    </w:p>
+    <w:p>
+      <w:pPr>
+        <w:pStyle w:val="Heading2"/>
+      </w:pPr>
+      <w:r>
+        <w:t>Q2. Why can a turbine not capture all of the wind energy?</w:t>
+      </w:r>
+    </w:p>
+    <w:p>
+      <w:r>
+        <w:t>建议回答：讲者A | 来源：R3</w:t>
+      </w:r>
+    </w:p>
+    <w:p>
+      <w:r>
+        <w:t>The air must retain motion after passing through the rotor. For the ideal actuator-disk model, the Betz limit is 16/27, or about 59.3%. Real turbines also have aerodynamic and downstream conversion losses.</w:t>
+      </w:r>
+    </w:p>
+    <w:p>
+      <w:r>
+        <w:t>中文：空气必须能流出转子；理想Betz上限约59.3%，实际还有损耗。</w:t>
+      </w:r>
+    </w:p>
+    <w:p>
+      <w:pPr>
+        <w:pStyle w:val="Heading2"/>
+      </w:pPr>
+      <w:r>
+        <w:t>Q3. Is a 35% capacity factor the same as 35% efficiency?</w:t>
+      </w:r>
+    </w:p>
+    <w:p>
+      <w:r>
+        <w:t>建议回答：讲者A | 来源：R3</w:t>
+      </w:r>
+    </w:p>
+    <w:p>
+      <w:r>
+        <w:t>No. Capacity factor compares energy over time with continuous rated output. Efficiency describes energy conversion. Our 35% capacity factor is an illustrative assumption, not a measured fleet average.</w:t>
+      </w:r>
+    </w:p>
+    <w:p>
+      <w:r>
+        <w:t>中文：容量因子是时间段内发电量/满额发电量；效率是能量转换比例。</w:t>
+      </w:r>
+    </w:p>
+    <w:p>
+      <w:pPr>
+        <w:pStyle w:val="Heading2"/>
+      </w:pPr>
+      <w:r>
+        <w:t>Q4. Why does power not keep rising as wind speed cubed?</w:t>
+      </w:r>
+    </w:p>
+    <w:p>
+      <w:r>
+        <w:t>建议回答：讲者A | 来源：R3</w:t>
+      </w:r>
+    </w:p>
+    <w:p>
+      <w:r>
+        <w:t>The cubic relation assumes fixed parameters in a simplified below-rated model. Actual power coefficients change, and controls limit output at the rated power. High winds may trigger protective shutdown.</w:t>
+      </w:r>
+    </w:p>
+    <w:p>
+      <w:r>
+        <w:t>中文：立方关系有假设；额定功率与保护约束会限制实际输出。</w:t>
+      </w:r>
+    </w:p>
+    <w:p>
+      <w:pPr>
+        <w:pStyle w:val="Heading2"/>
+      </w:pPr>
+      <w:r>
+        <w:t>Q5. Do all wind turbines use gearboxes?</w:t>
+      </w:r>
+    </w:p>
+    <w:p>
+      <w:r>
+        <w:t>建议回答：讲者A | 来源：R2, R3</w:t>
+      </w:r>
+    </w:p>
+    <w:p>
+      <w:r>
+        <w:t>No. Gearbox-based machines increase shaft speed, while direct-drive machines omit the gearbox. Generator type and converter arrangement also vary.</w:t>
+      </w:r>
+    </w:p>
+    <w:p>
+      <w:r>
+        <w:t>中文：齿轮箱和直驱是不同技术路线。</w:t>
+      </w:r>
+    </w:p>
+    <w:p>
+      <w:pPr>
+        <w:pStyle w:val="Heading2"/>
+      </w:pPr>
+      <w:r>
+        <w:t>Q6. Can wind power provide frequency support?</w:t>
+      </w:r>
+    </w:p>
+    <w:p>
+      <w:r>
+        <w:t>建议回答：讲者B | 来源：C3, R3</w:t>
+      </w:r>
+    </w:p>
+    <w:p>
+      <w:r>
+        <w:t>Yes, with suitable controls and within resource and equipment limits. A short response can use rotor kinetic energy; sustained upward response needs headroom and available wind or another energy source. Recovery must also be managed.</w:t>
+      </w:r>
+    </w:p>
+    <w:p>
+      <w:r>
+        <w:t>中文：可提供支持，但短时动能与持续备用不是一回事。</w:t>
+      </w:r>
+    </w:p>
+    <w:p>
+      <w:pPr>
+        <w:pStyle w:val="Heading2"/>
+      </w:pPr>
+      <w:r>
+        <w:t>Q7. How is wind voltage control different from a conventional AVR?</w:t>
+      </w:r>
+    </w:p>
+    <w:p>
+      <w:r>
+        <w:t>建议回答：讲者B | 来源：C2, R3</w:t>
+      </w:r>
+    </w:p>
+    <w:p>
+      <w:r>
+        <w:t>For a synchronous generator, an AVR acts on excitation. In the full-converter example, reactive current and plant-level setpoints support voltage within converter capability. Do not assign one control architecture to all wind turbines.</w:t>
+      </w:r>
+    </w:p>
+    <w:p>
+      <w:r>
+        <w:t>中文：同步机AVR调励磁；全变流器示例用无功电流和风场控制。</w:t>
+      </w:r>
+    </w:p>
+    <w:p>
+      <w:pPr>
+        <w:pStyle w:val="Heading2"/>
+      </w:pPr>
+      <w:r>
+        <w:t>Q8. Does every wind farm require a battery?</w:t>
+      </w:r>
+    </w:p>
+    <w:p>
+      <w:r>
+        <w:t>建议回答：讲者B | 来源：R3</w:t>
+      </w:r>
+    </w:p>
+    <w:p>
+      <w:r>
+        <w:t>No. Variability can be managed by system-wide flexibility, interconnection, forecasting and demand response as well as storage. Whether a dedicated battery is useful depends on grid conditions and economics.</w:t>
+      </w:r>
+    </w:p>
+    <w:p>
+      <w:r>
+        <w:t>中文：储能不是每个风场的硬性必需品，需要系统评估。</w:t>
+      </w:r>
+    </w:p>
+    <w:p>
+      <w:pPr>
+        <w:pStyle w:val="Heading2"/>
+      </w:pPr>
+      <w:r>
+        <w:t>Q9. Is wind really zero-emission?</w:t>
+      </w:r>
+    </w:p>
+    <w:p>
+      <w:r>
+        <w:t>建议回答：讲者B | 来源：R5</w:t>
+      </w:r>
+    </w:p>
+    <w:p>
+      <w:r>
+        <w:t>It has no fuel combustion during generation, but its life cycle includes manufacturing and construction emissions. The cited IPCC number is a 2014 literature median, not zero and not a prediction for every project.</w:t>
+      </w:r>
+    </w:p>
+    <w:p>
+      <w:r>
+        <w:t>中文：运行无燃烧不等于全生命周期零排放。</w:t>
+      </w:r>
+    </w:p>
+    <w:p>
+      <w:pPr>
+        <w:pStyle w:val="Heading2"/>
+      </w:pPr>
+      <w:r>
+        <w:t>Q10. Does 1.3 GW mean Hornsea 2 produces that power all year?</w:t>
+      </w:r>
+    </w:p>
+    <w:p>
+      <w:r>
+        <w:t>建议回答：讲者B | 来源：R6, R3</w:t>
+      </w:r>
+    </w:p>
+    <w:p>
+      <w:r>
+        <w:t>No. It is approximate rated capacity. Annual generation depends on the wind resource, turbine availability, wake losses, electrical losses and curtailment. We did not claim a project-specific annual energy figure.</w:t>
+      </w:r>
+    </w:p>
+    <w:p>
+      <w:r>
+        <w:t>中文：额定容量不是持续输出，也不是年发电量。</w:t>
+      </w:r>
+    </w:p>
+    <w:p>
+      <w:pPr>
+        <w:pStyle w:val="Heading2"/>
+      </w:pPr>
+      <w:r>
+        <w:t>Q11. What is the biggest weakness of wind compared with gas?</w:t>
+      </w:r>
+    </w:p>
+    <w:p>
+      <w:r>
+        <w:t>建议回答：讲者B | 来源：R3, R5</w:t>
+      </w:r>
+    </w:p>
+    <w:p>
+      <w:r>
+        <w:t>Variable resource availability makes output less directly controllable. Gas has its own fuel, emissions and operational constraints. Compare the entire generation portfolio and its required services rather than ranking one metric alone.</w:t>
+      </w:r>
+    </w:p>
+    <w:p>
+      <w:r>
+        <w:t>中文：最主要限制是资源波动，但天然气也有燃料与排放代价。</w:t>
       </w:r>
     </w:p>
     <w:p>
@@ -1949,30 +2241,7 @@
         <w:pStyle w:val="Heading1"/>
       </w:pPr>
       <w:r>
-        <w:t>交接句</w:t>
-      </w:r>
-    </w:p>
-    <w:p>
-      <w:r>
-        <w:t>A（第7页结尾）：We have now covered the conversion process and equipment. I will hand over to my partner to explain what happens when the wind farm becomes part of the grid.</w:t>
-      </w:r>
-    </w:p>
-    <w:p>
-      <w:r>
-        <w:t>B（第8页开头）：Thank you. Our course explains that frequency is closely linked to the balance between generation and demand, including losses.</w:t>
-      </w:r>
-    </w:p>
-    <w:p>
-      <w:pPr>
-        <w:pStyle w:val="Heading1"/>
-      </w:pPr>
-      <w:r>
-        <w:t>10分钟问答准备</w:t>
-      </w:r>
-    </w:p>
-    <w:p>
-      <w:r>
-        <w:t>A优先回答叶片原理、Betz上限、设备、公式和容量因子问题；B优先回答电网控制、环境、应用案例与比较。未被问到时无需展示全部备份页。</w:t>
+        <w:t>参考文献与公开链接</w:t>
       </w:r>
     </w:p>
     <w:p>
@@ -1980,22 +2249,22 @@
         <w:pStyle w:val="Heading2"/>
       </w:pPr>
       <w:r>
-        <w:t>Q1. Why can a turbine not capture all of the wind energy?</w:t>
-      </w:r>
-    </w:p>
-    <w:p>
-      <w:r>
-        <w:t>建议回答：讲者A | 来源：R3</w:t>
-      </w:r>
-    </w:p>
-    <w:p>
-      <w:r>
-        <w:t>The air must retain motion after passing through the rotor. For the ideal actuator-disk model, the Betz limit is 16/27, or about 59.3%. Real turbines also have aerodynamic and downstream conversion losses.</w:t>
-      </w:r>
-    </w:p>
-    <w:p>
-      <w:r>
-        <w:t>中文：空气必须能流出转子；理想Betz上限约59.3%，实际还有损耗。</w:t>
+        <w:t>R1</w:t>
+      </w:r>
+    </w:p>
+    <w:p>
+      <w:r>
+        <w:t>U.S. Department of Energy. How Do Wind Turbines Work?</w:t>
+      </w:r>
+    </w:p>
+    <w:p>
+      <w:r>
+        <w:t>https://www.energy.gov/eere/wind/how-do-wind-turbines-work</w:t>
+      </w:r>
+    </w:p>
+    <w:p>
+      <w:r>
+        <w:t>使用范围：Aerodynamic lift; horizontal-axis turbines; onshore and offshore wind.</w:t>
       </w:r>
     </w:p>
     <w:p>
@@ -2003,22 +2272,22 @@
         <w:pStyle w:val="Heading2"/>
       </w:pPr>
       <w:r>
-        <w:t>Q2. Is a 35% capacity factor the same as 35% efficiency?</w:t>
-      </w:r>
-    </w:p>
-    <w:p>
-      <w:r>
-        <w:t>建议回答：讲者A | 来源：R3</w:t>
-      </w:r>
-    </w:p>
-    <w:p>
-      <w:r>
-        <w:t>No. Capacity factor compares energy over time with continuous rated output. Efficiency describes energy conversion. Our 35% capacity factor is an illustrative assumption, not a measured fleet average.</w:t>
-      </w:r>
-    </w:p>
-    <w:p>
-      <w:r>
-        <w:t>中文：容量因子是时间段内发电量/满额发电量；效率是能量转换比例。</w:t>
+        <w:t>R2</w:t>
+      </w:r>
+    </w:p>
+    <w:p>
+      <w:r>
+        <w:t>U.S. Department of Energy. Inside a Wind Turbine.</w:t>
+      </w:r>
+    </w:p>
+    <w:p>
+      <w:r>
+        <w:t>https://www.energy.gov/eere/wind/inside-wind-turbine</w:t>
+      </w:r>
+    </w:p>
+    <w:p>
+      <w:r>
+        <w:t>使用范围：Blades, rotor, gearbox, generator, yaw and pitch systems.</w:t>
       </w:r>
     </w:p>
     <w:p>
@@ -2026,22 +2295,22 @@
         <w:pStyle w:val="Heading2"/>
       </w:pPr>
       <w:r>
-        <w:t>Q3. Why does power not keep rising as wind speed cubed?</w:t>
-      </w:r>
-    </w:p>
-    <w:p>
-      <w:r>
-        <w:t>建议回答：讲者A | 来源：R3</w:t>
-      </w:r>
-    </w:p>
-    <w:p>
-      <w:r>
-        <w:t>The cubic relation assumes fixed parameters in a simplified below-rated model. Actual power coefficients change, and controls limit output at the rated power. High winds may trigger protective shutdown.</w:t>
-      </w:r>
-    </w:p>
-    <w:p>
-      <w:r>
-        <w:t>中文：立方关系有假设；额定功率与保护约束会限制实际输出。</w:t>
+        <w:t>R3</w:t>
+      </w:r>
+    </w:p>
+    <w:p>
+      <w:r>
+        <w:t>Burton, T., Jenkins, N., Sharpe, D., &amp; Bossanyi, E. (2011). Wind Energy Handbook (2nd ed.). Wiley.</w:t>
+      </w:r>
+    </w:p>
+    <w:p>
+      <w:r>
+        <w:t>https://doi.org/10.1002/9781119992714</w:t>
+      </w:r>
+    </w:p>
+    <w:p>
+      <w:r>
+        <w:t>使用范围：Wind-power equation, Betz limit, aerodynamic control and wind-farm engineering.</w:t>
       </w:r>
     </w:p>
     <w:p>
@@ -2049,22 +2318,22 @@
         <w:pStyle w:val="Heading2"/>
       </w:pPr>
       <w:r>
-        <w:t>Q4. Do all wind turbines use gearboxes?</w:t>
-      </w:r>
-    </w:p>
-    <w:p>
-      <w:r>
-        <w:t>建议回答：讲者A | 来源：R2, R3</w:t>
-      </w:r>
-    </w:p>
-    <w:p>
-      <w:r>
-        <w:t>No. Gearbox-based machines increase shaft speed, while direct-drive machines omit the gearbox. Generator type and converter arrangement also vary.</w:t>
-      </w:r>
-    </w:p>
-    <w:p>
-      <w:r>
-        <w:t>中文：齿轮箱和直驱是不同技术路线。</w:t>
+        <w:t>R4</w:t>
+      </w:r>
+    </w:p>
+    <w:p>
+      <w:r>
+        <w:t>IRENA. (2025). Renewable Capacity Statistics 2025.</w:t>
+      </w:r>
+    </w:p>
+    <w:p>
+      <w:r>
+        <w:t>https://www.irena.org/Publications/2025/Mar/Renewable-capacity-statistics-2025</w:t>
+      </w:r>
+    </w:p>
+    <w:p>
+      <w:r>
+        <w:t>使用范围：End-2024 installed wind capacity; global and regional distribution. Capacity is not generation.</w:t>
       </w:r>
     </w:p>
     <w:p>
@@ -2072,22 +2341,22 @@
         <w:pStyle w:val="Heading2"/>
       </w:pPr>
       <w:r>
-        <w:t>Q5. Can wind power provide frequency support?</w:t>
-      </w:r>
-    </w:p>
-    <w:p>
-      <w:r>
-        <w:t>建议回答：讲者B | 来源：C3, R3</w:t>
-      </w:r>
-    </w:p>
-    <w:p>
-      <w:r>
-        <w:t>Yes, with suitable controls and within resource and equipment limits. A short response can use rotor kinetic energy; sustained upward response needs headroom and available wind or another energy source. Recovery must also be managed.</w:t>
-      </w:r>
-    </w:p>
-    <w:p>
-      <w:r>
-        <w:t>中文：可提供支持，但短时动能与持续备用不是一回事。</w:t>
+        <w:t>R5</w:t>
+      </w:r>
+    </w:p>
+    <w:p>
+      <w:r>
+        <w:t>IPCC. (2014). Climate Change 2014: Mitigation of Climate Change. Annex III, Table A.III.2.</w:t>
+      </w:r>
+    </w:p>
+    <w:p>
+      <w:r>
+        <w:t>https://www.ipcc.ch/site/assets/uploads/2018/02/ipcc_wg3_ar5_annex-iii.pdf</w:t>
+      </w:r>
+    </w:p>
+    <w:p>
+      <w:r>
+        <w:t>使用范围：Life-cycle greenhouse-gas emissions: onshore wind 11, gas combined cycle 490, pulverized coal 820 g CO2-eq/kWh (literature medians).</w:t>
       </w:r>
     </w:p>
     <w:p>
@@ -2095,22 +2364,22 @@
         <w:pStyle w:val="Heading2"/>
       </w:pPr>
       <w:r>
-        <w:t>Q6. How is wind voltage control different from a conventional AVR?</w:t>
-      </w:r>
-    </w:p>
-    <w:p>
-      <w:r>
-        <w:t>建议回答：讲者B | 来源：C2, R3</w:t>
-      </w:r>
-    </w:p>
-    <w:p>
-      <w:r>
-        <w:t>For a synchronous generator, an AVR acts on excitation. In the full-converter example, reactive current and plant-level setpoints support voltage within converter capability. Do not assign one control architecture to all wind turbines.</w:t>
-      </w:r>
-    </w:p>
-    <w:p>
-      <w:r>
-        <w:t>中文：同步机AVR调励磁；全变流器示例用无功电流和风场控制。</w:t>
+        <w:t>R6</w:t>
+      </w:r>
+    </w:p>
+    <w:p>
+      <w:r>
+        <w:t>Ørsted. Hornsea 2: project information.</w:t>
+      </w:r>
+    </w:p>
+    <w:p>
+      <w:r>
+        <w:t>https://hornseaproject2.co.uk/</w:t>
+      </w:r>
+    </w:p>
+    <w:p>
+      <w:r>
+        <w:t>使用范围：UK offshore case: 165 turbines, 8 MW each, approximately 1.3 GW; fully operational in 2022.</w:t>
       </w:r>
     </w:p>
     <w:p>
@@ -2118,22 +2387,22 @@
         <w:pStyle w:val="Heading2"/>
       </w:pPr>
       <w:r>
-        <w:t>Q7. Does every wind farm require a battery?</w:t>
-      </w:r>
-    </w:p>
-    <w:p>
-      <w:r>
-        <w:t>建议回答：讲者B | 来源：R3</w:t>
-      </w:r>
-    </w:p>
-    <w:p>
-      <w:r>
-        <w:t>No. Variability can be managed by system-wide flexibility, interconnection, forecasting and demand response as well as storage. Whether a dedicated battery is useful depends on grid conditions and economics.</w:t>
-      </w:r>
-    </w:p>
-    <w:p>
-      <w:r>
-        <w:t>中文：储能不是每个风场的硬性必需品，需要系统评估。</w:t>
+        <w:t>R7</w:t>
+      </w:r>
+    </w:p>
+    <w:p>
+      <w:r>
+        <w:t>Denholm, P., Hand, M., Jackson, M., &amp; Ong, S. (2009). Land-Use Requirements of Modern Wind Power Plants in the United States. NREL/TP-6A2-45834.</w:t>
+      </w:r>
+    </w:p>
+    <w:p>
+      <w:r>
+        <w:t>https://www.nrel.gov/docs/fy09osti/45834.pdf</w:t>
+      </w:r>
+    </w:p>
+    <w:p>
+      <w:r>
+        <w:t>使用范围：Distinguish direct land disturbance from total project area; land-use coexistence.</w:t>
       </w:r>
     </w:p>
     <w:p>
@@ -2141,237 +2410,22 @@
         <w:pStyle w:val="Heading2"/>
       </w:pPr>
       <w:r>
-        <w:t>Q8. Is wind really zero-emission?</w:t>
-      </w:r>
-    </w:p>
-    <w:p>
-      <w:r>
-        <w:t>建议回答：讲者B | 来源：R5</w:t>
-      </w:r>
-    </w:p>
-    <w:p>
-      <w:r>
-        <w:t>It has no fuel combustion during generation, but its life cycle includes manufacturing and construction emissions. The cited IPCC number is a 2014 literature median, not zero and not a prediction for every project.</w:t>
-      </w:r>
-    </w:p>
-    <w:p>
-      <w:r>
-        <w:t>中文：运行无燃烧不等于全生命周期零排放。</w:t>
-      </w:r>
-    </w:p>
-    <w:p>
-      <w:pPr>
-        <w:pStyle w:val="Heading2"/>
-      </w:pPr>
-      <w:r>
-        <w:t>Q9. Does 1.3 GW mean Hornsea 2 produces that power all year?</w:t>
-      </w:r>
-    </w:p>
-    <w:p>
-      <w:r>
-        <w:t>建议回答：讲者B | 来源：R6, R3</w:t>
-      </w:r>
-    </w:p>
-    <w:p>
-      <w:r>
-        <w:t>No. It is approximate rated capacity. Annual generation depends on the wind resource, turbine availability, wake losses, electrical losses and curtailment. We did not claim a project-specific annual energy figure.</w:t>
-      </w:r>
-    </w:p>
-    <w:p>
-      <w:r>
-        <w:t>中文：额定容量不是持续输出，也不是年发电量。</w:t>
-      </w:r>
-    </w:p>
-    <w:p>
-      <w:pPr>
-        <w:pStyle w:val="Heading2"/>
-      </w:pPr>
-      <w:r>
-        <w:t>Q10. What is the biggest weakness of wind compared with gas?</w:t>
-      </w:r>
-    </w:p>
-    <w:p>
-      <w:r>
-        <w:t>建议回答：讲者B | 来源：R3, R5</w:t>
-      </w:r>
-    </w:p>
-    <w:p>
-      <w:r>
-        <w:t>Variable resource availability makes output less directly controllable. Gas has its own fuel, emissions and operational constraints. Compare the entire generation portfolio and its required services rather than ranking one metric alone.</w:t>
-      </w:r>
-    </w:p>
-    <w:p>
-      <w:r>
-        <w:t>中文：最主要限制是资源波动，但天然气也有燃料与排放代价。</w:t>
-      </w:r>
-    </w:p>
-    <w:p>
-      <w:pPr>
-        <w:pStyle w:val="Heading1"/>
-      </w:pPr>
-      <w:r>
-        <w:t>参考文献与公开链接</w:t>
-      </w:r>
-    </w:p>
-    <w:p>
-      <w:pPr>
-        <w:pStyle w:val="Heading2"/>
-      </w:pPr>
-      <w:r>
-        <w:t>R1</w:t>
-      </w:r>
-    </w:p>
-    <w:p>
-      <w:r>
-        <w:t>U.S. Department of Energy. How Do Wind Turbines Work?</w:t>
-      </w:r>
-    </w:p>
-    <w:p>
-      <w:r>
-        <w:t>https://www.energy.gov/eere/wind/how-do-wind-turbines-work</w:t>
-      </w:r>
-    </w:p>
-    <w:p>
-      <w:r>
-        <w:t>使用范围：Aerodynamic lift; horizontal-axis turbines; onshore and offshore wind.</w:t>
-      </w:r>
-    </w:p>
-    <w:p>
-      <w:pPr>
-        <w:pStyle w:val="Heading2"/>
-      </w:pPr>
-      <w:r>
-        <w:t>R2</w:t>
-      </w:r>
-    </w:p>
-    <w:p>
-      <w:r>
-        <w:t>U.S. Department of Energy. Inside a Wind Turbine.</w:t>
-      </w:r>
-    </w:p>
-    <w:p>
-      <w:r>
-        <w:t>https://www.energy.gov/eere/wind/inside-wind-turbine</w:t>
-      </w:r>
-    </w:p>
-    <w:p>
-      <w:r>
-        <w:t>使用范围：Blades, rotor, gearbox, generator, yaw and pitch systems.</w:t>
-      </w:r>
-    </w:p>
-    <w:p>
-      <w:pPr>
-        <w:pStyle w:val="Heading2"/>
-      </w:pPr>
-      <w:r>
-        <w:t>R3</w:t>
-      </w:r>
-    </w:p>
-    <w:p>
-      <w:r>
-        <w:t>Burton, T., Jenkins, N., Sharpe, D., &amp; Bossanyi, E. (2011). Wind Energy Handbook (2nd ed.). Wiley.</w:t>
-      </w:r>
-    </w:p>
-    <w:p>
-      <w:r>
-        <w:t>https://doi.org/10.1002/9781119992714</w:t>
-      </w:r>
-    </w:p>
-    <w:p>
-      <w:r>
-        <w:t>使用范围：Wind-power equation, Betz limit, aerodynamic control and wind-farm engineering.</w:t>
-      </w:r>
-    </w:p>
-    <w:p>
-      <w:pPr>
-        <w:pStyle w:val="Heading2"/>
-      </w:pPr>
-      <w:r>
-        <w:t>R4</w:t>
-      </w:r>
-    </w:p>
-    <w:p>
-      <w:r>
-        <w:t>IRENA. (2025). Renewable Capacity Statistics 2025.</w:t>
-      </w:r>
-    </w:p>
-    <w:p>
-      <w:r>
-        <w:t>https://www.irena.org/Publications/2025/Mar/Renewable-capacity-statistics-2025</w:t>
-      </w:r>
-    </w:p>
-    <w:p>
-      <w:r>
-        <w:t>使用范围：End-2024 installed wind capacity; global and regional distribution. Capacity is not generation.</w:t>
-      </w:r>
-    </w:p>
-    <w:p>
-      <w:pPr>
-        <w:pStyle w:val="Heading2"/>
-      </w:pPr>
-      <w:r>
-        <w:t>R5</w:t>
-      </w:r>
-    </w:p>
-    <w:p>
-      <w:r>
-        <w:t>IPCC. (2014). Climate Change 2014: Mitigation of Climate Change. Annex III, Table A.III.2.</w:t>
-      </w:r>
-    </w:p>
-    <w:p>
-      <w:r>
-        <w:t>https://www.ipcc.ch/site/assets/uploads/2018/02/ipcc_wg3_ar5_annex-iii.pdf</w:t>
-      </w:r>
-    </w:p>
-    <w:p>
-      <w:r>
-        <w:t>使用范围：Life-cycle greenhouse-gas emissions: onshore wind 11, gas combined cycle 490, pulverized coal 820 g CO2-eq/kWh (literature medians).</w:t>
-      </w:r>
-    </w:p>
-    <w:p>
-      <w:pPr>
-        <w:pStyle w:val="Heading2"/>
-      </w:pPr>
-      <w:r>
-        <w:t>R6</w:t>
-      </w:r>
-    </w:p>
-    <w:p>
-      <w:r>
-        <w:t>Ørsted. Hornsea 2: project information.</w:t>
-      </w:r>
-    </w:p>
-    <w:p>
-      <w:r>
-        <w:t>https://hornseaproject2.co.uk/</w:t>
-      </w:r>
-    </w:p>
-    <w:p>
-      <w:r>
-        <w:t>使用范围：UK offshore case: 165 turbines, 8 MW each, approximately 1.3 GW; fully operational in 2022.</w:t>
-      </w:r>
-    </w:p>
-    <w:p>
-      <w:pPr>
-        <w:pStyle w:val="Heading2"/>
-      </w:pPr>
-      <w:r>
-        <w:t>R7</w:t>
-      </w:r>
-    </w:p>
-    <w:p>
-      <w:r>
-        <w:t>Denholm, P., Hand, M., Jackson, M., &amp; Ong, S. (2009). Land-Use Requirements of Modern Wind Power Plants in the United States. NREL/TP-6A2-45834.</w:t>
-      </w:r>
-    </w:p>
-    <w:p>
-      <w:r>
-        <w:t>https://www.nrel.gov/docs/fy09osti/45834.pdf</w:t>
-      </w:r>
-    </w:p>
-    <w:p>
-      <w:r>
-        <w:t>使用范围：Distinguish direct land disturbance from total project area; land-use coexistence.</w:t>
+        <w:t>R8</w:t>
+      </w:r>
+    </w:p>
+    <w:p>
+      <w:r>
+        <w:t>Natural Earth. Admin 0 – Countries, 1:50m (public-domain geographic data).</w:t>
+      </w:r>
+    </w:p>
+    <w:p>
+      <w:r>
+        <w:t>https://github.com/nvkelso/natural-earth-vector</w:t>
+      </w:r>
+    </w:p>
+    <w:p>
+      <w:r>
+        <w:t>使用范围：Verified 1:50m country polygons used for the original North Sea map. Hornsea 2 is marked approximately for teaching; the marker is not a verified project boundary.</w:t>
       </w:r>
     </w:p>
     <w:p>

</xml_diff>